<commit_message>
Ajuste na tela inicial com dashboard e atualizacao do README
</commit_message>
<xml_diff>
--- a/Documentacoes/Principal/Documentação - Sistema de Controle de Empréstimos.docx
+++ b/Documentacoes/Principal/Documentação - Sistema de Controle de Empréstimos.docx
@@ -12828,7 +12828,7 @@
           <w:noProof/>
         </w:rPr>
         <w:drawing>
-          <wp:inline distT="0" distB="0" distL="0" distR="0" wp14:anchorId="1584298C" wp14:editId="306D0E2D">
+          <wp:inline distT="0" distB="0" distL="0" distR="0" wp14:anchorId="1584298C" wp14:editId="6D638397">
             <wp:extent cx="5406887" cy="3348086"/>
             <wp:effectExtent l="0" t="0" r="3810" b="5080"/>
             <wp:docPr id="1277101318" name="Imagem 2"/>
@@ -13454,7 +13454,7 @@
           <w:noProof/>
         </w:rPr>
         <w:drawing>
-          <wp:inline distT="0" distB="0" distL="0" distR="0" wp14:anchorId="68B3340E" wp14:editId="71C1BC98">
+          <wp:inline distT="0" distB="0" distL="0" distR="0" wp14:anchorId="68B3340E" wp14:editId="2EF44E10">
             <wp:extent cx="5276850" cy="3409505"/>
             <wp:effectExtent l="0" t="0" r="0" b="635"/>
             <wp:docPr id="1340537565" name="Imagem 3"/>
@@ -14220,7 +14220,7 @@
           <w:lang w:eastAsia="pt-BR"/>
         </w:rPr>
         <w:drawing>
-          <wp:inline distT="0" distB="0" distL="0" distR="0" wp14:anchorId="210315F5" wp14:editId="30C43212">
+          <wp:inline distT="0" distB="0" distL="0" distR="0" wp14:anchorId="210315F5" wp14:editId="5B503453">
             <wp:extent cx="5760085" cy="3398520"/>
             <wp:effectExtent l="0" t="0" r="0" b="0"/>
             <wp:docPr id="797472422" name="Imagem 7"/>
@@ -17185,17 +17185,51 @@
     </w:p>
     <w:p>
       <w:pPr>
-        <w:rPr>
-          <w:lang w:eastAsia="pt-BR"/>
-        </w:rPr>
-      </w:pPr>
-    </w:p>
-    <w:p>
-      <w:pPr>
-        <w:rPr>
-          <w:lang w:eastAsia="pt-BR"/>
-        </w:rPr>
-      </w:pPr>
+        <w:jc w:val="center"/>
+        <w:rPr>
+          <w:lang w:eastAsia="pt-BR"/>
+        </w:rPr>
+      </w:pPr>
+      <w:r>
+        <w:rPr>
+          <w:lang w:eastAsia="pt-BR"/>
+        </w:rPr>
+        <w:drawing>
+          <wp:inline distT="0" distB="0" distL="0" distR="0" wp14:anchorId="3F6B41E6" wp14:editId="073551A0">
+            <wp:extent cx="5760085" cy="2630805"/>
+            <wp:effectExtent l="0" t="0" r="0" b="0"/>
+            <wp:docPr id="984700075" name="Imagem 1"/>
+            <wp:cNvGraphicFramePr>
+              <a:graphicFrameLocks xmlns:a="http://schemas.openxmlformats.org/drawingml/2006/main" noChangeAspect="1"/>
+            </wp:cNvGraphicFramePr>
+            <a:graphic xmlns:a="http://schemas.openxmlformats.org/drawingml/2006/main">
+              <a:graphicData uri="http://schemas.openxmlformats.org/drawingml/2006/picture">
+                <pic:pic xmlns:pic="http://schemas.openxmlformats.org/drawingml/2006/picture">
+                  <pic:nvPicPr>
+                    <pic:cNvPr id="984700075" name=""/>
+                    <pic:cNvPicPr/>
+                  </pic:nvPicPr>
+                  <pic:blipFill>
+                    <a:blip r:embed="rId18"/>
+                    <a:stretch>
+                      <a:fillRect/>
+                    </a:stretch>
+                  </pic:blipFill>
+                  <pic:spPr>
+                    <a:xfrm>
+                      <a:off x="0" y="0"/>
+                      <a:ext cx="5760085" cy="2630805"/>
+                    </a:xfrm>
+                    <a:prstGeom prst="rect">
+                      <a:avLst/>
+                    </a:prstGeom>
+                  </pic:spPr>
+                </pic:pic>
+              </a:graphicData>
+            </a:graphic>
+          </wp:inline>
+        </w:drawing>
+      </w:r>
     </w:p>
     <w:p>
       <w:pPr>
@@ -17336,6 +17370,7 @@
         <w:rPr>
           <w:lang w:eastAsia="pt-BR"/>
         </w:rPr>
+        <w:lastRenderedPageBreak/>
         <w:t>Exclusão de registros;</w:t>
       </w:r>
     </w:p>
@@ -17438,7 +17473,6 @@
           <w:sz w:val="24"/>
           <w:szCs w:val="24"/>
         </w:rPr>
-        <w:lastRenderedPageBreak/>
         <w:t>Figura 12 – Tela de Gerenciamento de Alunos</w:t>
       </w:r>
     </w:p>
@@ -17470,7 +17504,7 @@
                     <pic:cNvPicPr/>
                   </pic:nvPicPr>
                   <pic:blipFill>
-                    <a:blip r:embed="rId18"/>
+                    <a:blip r:embed="rId19"/>
                     <a:stretch>
                       <a:fillRect/>
                     </a:stretch>
@@ -17667,6 +17701,7 @@
         <w:rPr>
           <w:lang w:eastAsia="pt-BR"/>
         </w:rPr>
+        <w:lastRenderedPageBreak/>
         <w:t xml:space="preserve">Navegação pela </w:t>
       </w:r>
       <w:proofErr w:type="spellStart"/>
@@ -17740,7 +17775,6 @@
           <w:sz w:val="24"/>
           <w:szCs w:val="24"/>
         </w:rPr>
-        <w:lastRenderedPageBreak/>
         <w:t>Figura 13 – Tela de Gerenciamento do Responsáveis</w:t>
       </w:r>
     </w:p>
@@ -17772,7 +17806,7 @@
                     <pic:cNvPicPr/>
                   </pic:nvPicPr>
                   <pic:blipFill>
-                    <a:blip r:embed="rId19"/>
+                    <a:blip r:embed="rId20"/>
                     <a:stretch>
                       <a:fillRect/>
                     </a:stretch>
@@ -17904,6 +17938,7 @@
         </w:numPr>
       </w:pPr>
       <w:r>
+        <w:lastRenderedPageBreak/>
         <w:t xml:space="preserve">Navegação pela </w:t>
       </w:r>
       <w:proofErr w:type="spellStart"/>
@@ -17953,7 +17988,6 @@
           <w:sz w:val="24"/>
           <w:szCs w:val="24"/>
         </w:rPr>
-        <w:lastRenderedPageBreak/>
         <w:t>Figura 14 – Tela de Gerenciamento de livros</w:t>
       </w:r>
     </w:p>
@@ -17981,7 +18015,7 @@
                     <pic:cNvPicPr/>
                   </pic:nvPicPr>
                   <pic:blipFill>
-                    <a:blip r:embed="rId20"/>
+                    <a:blip r:embed="rId21"/>
                     <a:stretch>
                       <a:fillRect/>
                     </a:stretch>
@@ -18172,6 +18206,7 @@
         <w:rPr>
           <w:lang w:eastAsia="pt-BR"/>
         </w:rPr>
+        <w:lastRenderedPageBreak/>
         <w:t xml:space="preserve">Navegação pela </w:t>
       </w:r>
       <w:proofErr w:type="spellStart"/>
@@ -18259,7 +18294,6 @@
           <w:sz w:val="24"/>
           <w:szCs w:val="24"/>
         </w:rPr>
-        <w:lastRenderedPageBreak/>
         <w:t>Figura 15 – Tela de Gerenciamento de Exemplares</w:t>
       </w:r>
     </w:p>
@@ -18288,7 +18322,7 @@
                     <pic:cNvPicPr/>
                   </pic:nvPicPr>
                   <pic:blipFill>
-                    <a:blip r:embed="rId21"/>
+                    <a:blip r:embed="rId22"/>
                     <a:stretch>
                       <a:fillRect/>
                     </a:stretch>
@@ -18488,6 +18522,7 @@
         <w:rPr>
           <w:lang w:eastAsia="pt-BR"/>
         </w:rPr>
+        <w:lastRenderedPageBreak/>
         <w:t xml:space="preserve">A tela de gerenciamento de multas foi estruturada para permitir melhor controle das penalidades aplicadas pelo sistema, auxiliando no gerenciamento financeiro relacionado aos empréstimos realizados pela biblioteca escolar. A </w:t>
       </w:r>
       <w:proofErr w:type="spellStart"/>
@@ -18555,7 +18590,6 @@
           <w:sz w:val="24"/>
           <w:szCs w:val="24"/>
         </w:rPr>
-        <w:lastRenderedPageBreak/>
         <w:t>Figura 16 – Tela de Gerenciamento de Multas</w:t>
       </w:r>
     </w:p>
@@ -18587,7 +18621,7 @@
                     <pic:cNvPicPr/>
                   </pic:nvPicPr>
                   <pic:blipFill>
-                    <a:blip r:embed="rId22"/>
+                    <a:blip r:embed="rId23"/>
                     <a:stretch>
                       <a:fillRect/>
                     </a:stretch>
@@ -18778,6 +18812,7 @@
         <w:rPr>
           <w:lang w:eastAsia="pt-BR"/>
         </w:rPr>
+        <w:lastRenderedPageBreak/>
         <w:t>Controle de atrasos;</w:t>
       </w:r>
     </w:p>
@@ -18876,7 +18911,6 @@
           <w:sz w:val="24"/>
           <w:szCs w:val="24"/>
         </w:rPr>
-        <w:lastRenderedPageBreak/>
         <w:t>Figura 17 – Tela de Gerenciamento de Empréstimos</w:t>
       </w:r>
     </w:p>
@@ -18908,7 +18942,7 @@
                     <pic:cNvPicPr/>
                   </pic:nvPicPr>
                   <pic:blipFill>
-                    <a:blip r:embed="rId23"/>
+                    <a:blip r:embed="rId24"/>
                     <a:stretch>
                       <a:fillRect/>
                     </a:stretch>
@@ -24758,6 +24792,7 @@
   <w:style w:type="character" w:default="1" w:styleId="Fontepargpadro">
     <w:name w:val="Default Paragraph Font"/>
     <w:uiPriority w:val="1"/>
+    <w:semiHidden/>
     <w:unhideWhenUsed/>
   </w:style>
   <w:style w:type="table" w:default="1" w:styleId="Tabelanormal">

</xml_diff>